<commit_message>
Folder HTML dan js, tanpa CSS
</commit_message>
<xml_diff>
--- a/P6_FSWD3_RIZKY JEIN NUR AULIA.docx
+++ b/P6_FSWD3_RIZKY JEIN NUR AULIA.docx
@@ -22,16 +22,6 @@
           <w:sz w:val="24"/>
           <w:szCs w:val="24"/>
         </w:rPr>
-        <w:t>4</w:t>
-      </w:r>
-      <w:r>
-        <w:rPr>
-          <w:rFonts w:ascii="Times New Roman" w:hAnsi="Times New Roman" w:cs="Times New Roman"/>
-          <w:b/>
-          <w:bCs/>
-          <w:sz w:val="24"/>
-          <w:szCs w:val="24"/>
-        </w:rPr>
         <w:t>LAPORAN</w:t>
       </w:r>
     </w:p>
@@ -78,30 +68,40 @@
           <w:sz w:val="24"/>
           <w:szCs w:val="24"/>
         </w:rPr>
-        <w:t>DASAR WEB DEVELOPMENT DAN COLLABORATIVE DEVELOPMENT</w:t>
-      </w:r>
-    </w:p>
-    <w:p>
-      <w:pPr>
-        <w:spacing w:line="360" w:lineRule="auto"/>
-        <w:jc w:val="center"/>
-        <w:rPr>
-          <w:rFonts w:ascii="Times New Roman" w:hAnsi="Times New Roman" w:cs="Times New Roman"/>
-          <w:b/>
-          <w:bCs/>
-          <w:sz w:val="24"/>
-          <w:szCs w:val="24"/>
-        </w:rPr>
-      </w:pPr>
-      <w:r>
-        <w:rPr>
-          <w:rFonts w:ascii="Times New Roman" w:hAnsi="Times New Roman" w:cs="Times New Roman"/>
-          <w:b/>
-          <w:bCs/>
-          <w:sz w:val="24"/>
-          <w:szCs w:val="24"/>
-        </w:rPr>
-        <w:t>PERTEMUAN 1</w:t>
+        <w:t>JAVASCRIPT</w:t>
+      </w:r>
+    </w:p>
+    <w:p>
+      <w:pPr>
+        <w:spacing w:line="360" w:lineRule="auto"/>
+        <w:jc w:val="center"/>
+        <w:rPr>
+          <w:rFonts w:ascii="Times New Roman" w:hAnsi="Times New Roman" w:cs="Times New Roman"/>
+          <w:b/>
+          <w:bCs/>
+          <w:sz w:val="24"/>
+          <w:szCs w:val="24"/>
+        </w:rPr>
+      </w:pPr>
+      <w:r>
+        <w:rPr>
+          <w:rFonts w:ascii="Times New Roman" w:hAnsi="Times New Roman" w:cs="Times New Roman"/>
+          <w:b/>
+          <w:bCs/>
+          <w:sz w:val="24"/>
+          <w:szCs w:val="24"/>
+        </w:rPr>
+        <w:t xml:space="preserve">PERTEMUAN </w:t>
+      </w:r>
+      <w:r>
+        <w:rPr>
+          <w:rFonts w:ascii="Times New Roman" w:hAnsi="Times New Roman" w:cs="Times New Roman"/>
+          <w:b/>
+          <w:bCs/>
+          <w:sz w:val="24"/>
+          <w:szCs w:val="24"/>
+        </w:rPr>
+        <w:t>6</w:t>
       </w:r>
     </w:p>
     <w:p>
@@ -266,58 +266,42 @@
           <w:rFonts w:ascii="Times New Roman" w:hAnsi="Times New Roman" w:cs="Times New Roman"/>
           <w:b/>
           <w:bCs/>
-          <w:i/>
-          <w:iCs/>
-          <w:sz w:val="24"/>
-          <w:szCs w:val="24"/>
-        </w:rPr>
-      </w:pPr>
-      <w:r>
-        <w:rPr>
-          <w:rFonts w:ascii="Times New Roman" w:hAnsi="Times New Roman" w:cs="Times New Roman"/>
-          <w:b/>
-          <w:bCs/>
-          <w:i/>
-          <w:iCs/>
-          <w:sz w:val="24"/>
-          <w:szCs w:val="24"/>
-        </w:rPr>
-        <w:t>Repository on GitHub</w:t>
-      </w:r>
-    </w:p>
-    <w:p>
-      <w:pPr>
-        <w:spacing w:line="360" w:lineRule="auto"/>
-        <w:jc w:val="center"/>
-        <w:rPr>
-          <w:rFonts w:ascii="Times New Roman" w:hAnsi="Times New Roman" w:cs="Times New Roman"/>
-          <w:b/>
-          <w:bCs/>
-          <w:sz w:val="24"/>
-          <w:szCs w:val="24"/>
-        </w:rPr>
-      </w:pPr>
-      <w:proofErr w:type="spellStart"/>
-      <w:r>
-        <w:rPr>
-          <w:rFonts w:ascii="Times New Roman" w:hAnsi="Times New Roman" w:cs="Times New Roman"/>
-          <w:b/>
-          <w:bCs/>
-          <w:sz w:val="24"/>
-          <w:szCs w:val="24"/>
-        </w:rPr>
-        <w:t>Disusun</w:t>
-      </w:r>
-      <w:proofErr w:type="spellEnd"/>
-      <w:r>
-        <w:rPr>
-          <w:rFonts w:ascii="Times New Roman" w:hAnsi="Times New Roman" w:cs="Times New Roman"/>
-          <w:b/>
-          <w:bCs/>
-          <w:sz w:val="24"/>
-          <w:szCs w:val="24"/>
-        </w:rPr>
-        <w:t xml:space="preserve"> Oleh</w:t>
+          <w:sz w:val="24"/>
+          <w:szCs w:val="24"/>
+        </w:rPr>
+      </w:pPr>
+      <w:r>
+        <w:rPr>
+          <w:rFonts w:ascii="Times New Roman" w:hAnsi="Times New Roman" w:cs="Times New Roman"/>
+          <w:b/>
+          <w:bCs/>
+          <w:sz w:val="24"/>
+          <w:szCs w:val="24"/>
+        </w:rPr>
+        <w:t>Dasar JavaScript</w:t>
+      </w:r>
+    </w:p>
+    <w:p>
+      <w:pPr>
+        <w:spacing w:line="360" w:lineRule="auto"/>
+        <w:jc w:val="center"/>
+        <w:rPr>
+          <w:rFonts w:ascii="Times New Roman" w:hAnsi="Times New Roman" w:cs="Times New Roman"/>
+          <w:b/>
+          <w:bCs/>
+          <w:sz w:val="24"/>
+          <w:szCs w:val="24"/>
+        </w:rPr>
+      </w:pPr>
+      <w:r>
+        <w:rPr>
+          <w:rFonts w:ascii="Times New Roman" w:hAnsi="Times New Roman" w:cs="Times New Roman"/>
+          <w:b/>
+          <w:bCs/>
+          <w:sz w:val="24"/>
+          <w:szCs w:val="24"/>
+        </w:rPr>
+        <w:t>Disusun Oleh</w:t>
       </w:r>
       <w:r>
         <w:rPr>
@@ -552,29 +536,7 @@
           <w:sz w:val="24"/>
           <w:szCs w:val="24"/>
         </w:rPr>
-        <w:t xml:space="preserve">Buat </w:t>
-      </w:r>
-      <w:proofErr w:type="spellStart"/>
-      <w:r>
-        <w:rPr>
-          <w:rFonts w:ascii="Times New Roman" w:hAnsi="Times New Roman" w:cs="Times New Roman"/>
-          <w:b/>
-          <w:bCs/>
-          <w:sz w:val="24"/>
-          <w:szCs w:val="24"/>
-        </w:rPr>
-        <w:t>dokumen</w:t>
-      </w:r>
-      <w:proofErr w:type="spellEnd"/>
-      <w:r>
-        <w:rPr>
-          <w:rFonts w:ascii="Times New Roman" w:hAnsi="Times New Roman" w:cs="Times New Roman"/>
-          <w:b/>
-          <w:bCs/>
-          <w:sz w:val="24"/>
-          <w:szCs w:val="24"/>
-        </w:rPr>
-        <w:t xml:space="preserve"> index.html dan form.html</w:t>
+        <w:t>Buat dokumen index.html dan form.html</w:t>
       </w:r>
     </w:p>
     <w:p>
@@ -663,29 +625,7 @@
           <w:sz w:val="24"/>
           <w:szCs w:val="24"/>
         </w:rPr>
-        <w:t xml:space="preserve">Pada form.html, buat </w:t>
-      </w:r>
-      <w:proofErr w:type="spellStart"/>
-      <w:r>
-        <w:rPr>
-          <w:rFonts w:ascii="Times New Roman" w:hAnsi="Times New Roman" w:cs="Times New Roman"/>
-          <w:b/>
-          <w:bCs/>
-          <w:sz w:val="24"/>
-          <w:szCs w:val="24"/>
-        </w:rPr>
-        <w:t>tampilan</w:t>
-      </w:r>
-      <w:proofErr w:type="spellEnd"/>
-      <w:r>
-        <w:rPr>
-          <w:rFonts w:ascii="Times New Roman" w:hAnsi="Times New Roman" w:cs="Times New Roman"/>
-          <w:b/>
-          <w:bCs/>
-          <w:sz w:val="24"/>
-          <w:szCs w:val="24"/>
-        </w:rPr>
-        <w:t xml:space="preserve"> form</w:t>
+        <w:t>Pada form.html, buat tampilan form</w:t>
       </w:r>
     </w:p>
     <w:p>
@@ -781,7 +721,6 @@
           <w:szCs w:val="24"/>
         </w:rPr>
       </w:pPr>
-      <w:proofErr w:type="spellStart"/>
       <w:r>
         <w:rPr>
           <w:rFonts w:ascii="Times New Roman" w:hAnsi="Times New Roman" w:cs="Times New Roman"/>
@@ -791,75 +730,8 @@
           <w:szCs w:val="24"/>
         </w:rPr>
         <w:lastRenderedPageBreak/>
-        <w:t>Unggah</w:t>
-      </w:r>
-      <w:proofErr w:type="spellEnd"/>
-      <w:r>
-        <w:rPr>
-          <w:rFonts w:ascii="Times New Roman" w:hAnsi="Times New Roman" w:cs="Times New Roman"/>
-          <w:b/>
-          <w:bCs/>
-          <w:sz w:val="24"/>
-          <w:szCs w:val="24"/>
-        </w:rPr>
-        <w:t xml:space="preserve"> ke </w:t>
-      </w:r>
-      <w:proofErr w:type="spellStart"/>
-      <w:r>
-        <w:rPr>
-          <w:rFonts w:ascii="Times New Roman" w:hAnsi="Times New Roman" w:cs="Times New Roman"/>
-          <w:b/>
-          <w:bCs/>
-          <w:sz w:val="24"/>
-          <w:szCs w:val="24"/>
-        </w:rPr>
-        <w:t>repositori</w:t>
-      </w:r>
-      <w:proofErr w:type="spellEnd"/>
-      <w:r>
-        <w:rPr>
-          <w:rFonts w:ascii="Times New Roman" w:hAnsi="Times New Roman" w:cs="Times New Roman"/>
-          <w:b/>
-          <w:bCs/>
-          <w:sz w:val="24"/>
-          <w:szCs w:val="24"/>
-        </w:rPr>
-        <w:t xml:space="preserve"> </w:t>
-      </w:r>
-      <w:proofErr w:type="spellStart"/>
-      <w:r>
-        <w:rPr>
-          <w:rFonts w:ascii="Times New Roman" w:hAnsi="Times New Roman" w:cs="Times New Roman"/>
-          <w:b/>
-          <w:bCs/>
-          <w:sz w:val="24"/>
-          <w:szCs w:val="24"/>
-        </w:rPr>
-        <w:t>gitlab</w:t>
-      </w:r>
-      <w:proofErr w:type="spellEnd"/>
-      <w:r>
-        <w:rPr>
-          <w:rFonts w:ascii="Times New Roman" w:hAnsi="Times New Roman" w:cs="Times New Roman"/>
-          <w:b/>
-          <w:bCs/>
-          <w:sz w:val="24"/>
-          <w:szCs w:val="24"/>
-        </w:rPr>
-        <w:t xml:space="preserve"> dan </w:t>
-      </w:r>
-      <w:proofErr w:type="spellStart"/>
-      <w:r>
-        <w:rPr>
-          <w:rFonts w:ascii="Times New Roman" w:hAnsi="Times New Roman" w:cs="Times New Roman"/>
-          <w:b/>
-          <w:bCs/>
-          <w:sz w:val="24"/>
-          <w:szCs w:val="24"/>
-        </w:rPr>
-        <w:t>github</w:t>
-      </w:r>
-      <w:proofErr w:type="spellEnd"/>
+        <w:t>Unggah ke repositori gitlab dan github</w:t>
+      </w:r>
     </w:p>
     <w:p>
       <w:pPr>
@@ -923,18 +795,70 @@
     </w:p>
     <w:p>
       <w:pPr>
-        <w:pStyle w:val="ListParagraph"/>
-        <w:spacing w:line="360" w:lineRule="auto"/>
-        <w:ind w:left="0"/>
-        <w:jc w:val="center"/>
-        <w:rPr>
-          <w:rFonts w:ascii="Times New Roman" w:hAnsi="Times New Roman" w:cs="Times New Roman"/>
-          <w:b/>
-          <w:bCs/>
-          <w:sz w:val="24"/>
-          <w:szCs w:val="24"/>
-        </w:rPr>
-      </w:pPr>
+        <w:jc w:val="center"/>
+        <w:rPr>
+          <w:rFonts w:ascii="Times New Roman" w:hAnsi="Times New Roman" w:cs="Times New Roman"/>
+          <w:b/>
+          <w:bCs/>
+          <w:sz w:val="24"/>
+          <w:szCs w:val="24"/>
+        </w:rPr>
+      </w:pPr>
+      <w:r>
+        <w:rPr>
+          <w:rFonts w:ascii="Times New Roman" w:hAnsi="Times New Roman" w:cs="Times New Roman"/>
+          <w:b/>
+          <w:bCs/>
+          <w:sz w:val="24"/>
+          <w:szCs w:val="24"/>
+        </w:rPr>
+        <w:br w:type="page"/>
+      </w:r>
+      <w:r>
+        <w:rPr>
+          <w:rFonts w:ascii="Times New Roman" w:hAnsi="Times New Roman" w:cs="Times New Roman"/>
+          <w:b/>
+          <w:bCs/>
+          <w:sz w:val="24"/>
+          <w:szCs w:val="24"/>
+        </w:rPr>
+        <w:lastRenderedPageBreak/>
+        <w:drawing>
+          <wp:inline distT="0" distB="0" distL="0" distR="0" wp14:anchorId="3E2836BC" wp14:editId="27C8A0EA">
+            <wp:extent cx="2867425" cy="466790"/>
+            <wp:effectExtent l="0" t="0" r="9525" b="9525"/>
+            <wp:docPr id="120" name="Picture 120"/>
+            <wp:cNvGraphicFramePr>
+              <a:graphicFrameLocks xmlns:a="http://schemas.openxmlformats.org/drawingml/2006/main" noChangeAspect="1"/>
+            </wp:cNvGraphicFramePr>
+            <a:graphic xmlns:a="http://schemas.openxmlformats.org/drawingml/2006/main">
+              <a:graphicData uri="http://schemas.openxmlformats.org/drawingml/2006/picture">
+                <pic:pic xmlns:pic="http://schemas.openxmlformats.org/drawingml/2006/picture">
+                  <pic:nvPicPr>
+                    <pic:cNvPr id="1" name=""/>
+                    <pic:cNvPicPr/>
+                  </pic:nvPicPr>
+                  <pic:blipFill>
+                    <a:blip r:embed="rId10"/>
+                    <a:stretch>
+                      <a:fillRect/>
+                    </a:stretch>
+                  </pic:blipFill>
+                  <pic:spPr>
+                    <a:xfrm>
+                      <a:off x="0" y="0"/>
+                      <a:ext cx="2867425" cy="466790"/>
+                    </a:xfrm>
+                    <a:prstGeom prst="rect">
+                      <a:avLst/>
+                    </a:prstGeom>
+                  </pic:spPr>
+                </pic:pic>
+              </a:graphicData>
+            </a:graphic>
+          </wp:inline>
+        </w:drawing>
+      </w:r>
     </w:p>
     <w:p>
       <w:pPr>
@@ -988,7 +912,6 @@
           <w:sz w:val="24"/>
           <w:szCs w:val="24"/>
         </w:rPr>
-        <w:lastRenderedPageBreak/>
         <w:drawing>
           <wp:inline distT="0" distB="0" distL="0" distR="0" wp14:anchorId="2EE0AA90" wp14:editId="25436B09">
             <wp:extent cx="5247640" cy="3083560"/>
@@ -1005,7 +928,7 @@
                     <pic:cNvPicPr/>
                   </pic:nvPicPr>
                   <pic:blipFill>
-                    <a:blip r:embed="rId10"/>
+                    <a:blip r:embed="rId11"/>
                     <a:stretch>
                       <a:fillRect/>
                     </a:stretch>
@@ -1065,7 +988,7 @@
                     <pic:cNvPicPr/>
                   </pic:nvPicPr>
                   <pic:blipFill>
-                    <a:blip r:embed="rId11"/>
+                    <a:blip r:embed="rId12"/>
                     <a:stretch>
                       <a:fillRect/>
                     </a:stretch>
@@ -1153,7 +1076,7 @@
                     <pic:cNvPicPr/>
                   </pic:nvPicPr>
                   <pic:blipFill>
-                    <a:blip r:embed="rId12"/>
+                    <a:blip r:embed="rId13"/>
                     <a:stretch>
                       <a:fillRect/>
                     </a:stretch>
@@ -1213,7 +1136,7 @@
                     <pic:cNvPicPr/>
                   </pic:nvPicPr>
                   <pic:blipFill>
-                    <a:blip r:embed="rId13"/>
+                    <a:blip r:embed="rId14"/>
                     <a:stretch>
                       <a:fillRect/>
                     </a:stretch>
@@ -1257,6 +1180,7 @@
           <w:sz w:val="24"/>
           <w:szCs w:val="24"/>
         </w:rPr>
+        <w:lastRenderedPageBreak/>
         <w:drawing>
           <wp:inline distT="0" distB="0" distL="0" distR="0" wp14:anchorId="1FFA6011" wp14:editId="63443501">
             <wp:extent cx="4267796" cy="619211"/>
@@ -1273,7 +1197,7 @@
                     <pic:cNvPicPr/>
                   </pic:nvPicPr>
                   <pic:blipFill>
-                    <a:blip r:embed="rId14"/>
+                    <a:blip r:embed="rId15"/>
                     <a:stretch>
                       <a:fillRect/>
                     </a:stretch>
@@ -1317,7 +1241,6 @@
           <w:sz w:val="24"/>
           <w:szCs w:val="24"/>
         </w:rPr>
-        <w:lastRenderedPageBreak/>
         <w:drawing>
           <wp:inline distT="0" distB="0" distL="0" distR="0" wp14:anchorId="2F9C412F" wp14:editId="187D7ED8">
             <wp:extent cx="4267796" cy="1181265"/>
@@ -1334,7 +1257,7 @@
                     <pic:cNvPicPr/>
                   </pic:nvPicPr>
                   <pic:blipFill>
-                    <a:blip r:embed="rId15"/>
+                    <a:blip r:embed="rId16"/>
                     <a:stretch>
                       <a:fillRect/>
                     </a:stretch>
@@ -1420,7 +1343,7 @@
                     <pic:cNvPicPr/>
                   </pic:nvPicPr>
                   <pic:blipFill>
-                    <a:blip r:embed="rId16"/>
+                    <a:blip r:embed="rId17"/>
                     <a:stretch>
                       <a:fillRect/>
                     </a:stretch>
@@ -1506,7 +1429,7 @@
                     <pic:cNvPicPr/>
                   </pic:nvPicPr>
                   <pic:blipFill>
-                    <a:blip r:embed="rId17"/>
+                    <a:blip r:embed="rId18"/>
                     <a:stretch>
                       <a:fillRect/>
                     </a:stretch>
@@ -1564,7 +1487,7 @@
                     <pic:cNvPicPr/>
                   </pic:nvPicPr>
                   <pic:blipFill>
-                    <a:blip r:embed="rId18"/>
+                    <a:blip r:embed="rId19"/>
                     <a:stretch>
                       <a:fillRect/>
                     </a:stretch>
@@ -1583,6 +1506,27 @@
             </a:graphic>
           </wp:inline>
         </w:drawing>
+      </w:r>
+    </w:p>
+    <w:p>
+      <w:pPr>
+        <w:rPr>
+          <w:rFonts w:ascii="Times New Roman" w:hAnsi="Times New Roman" w:cs="Times New Roman"/>
+          <w:b/>
+          <w:bCs/>
+          <w:sz w:val="24"/>
+          <w:szCs w:val="24"/>
+        </w:rPr>
+      </w:pPr>
+      <w:r>
+        <w:rPr>
+          <w:rFonts w:ascii="Times New Roman" w:hAnsi="Times New Roman" w:cs="Times New Roman"/>
+          <w:b/>
+          <w:bCs/>
+          <w:sz w:val="24"/>
+          <w:szCs w:val="24"/>
+        </w:rPr>
+        <w:br w:type="page"/>
       </w:r>
     </w:p>
     <w:p>
@@ -1610,6 +1554,7 @@
           <w:sz w:val="24"/>
           <w:szCs w:val="24"/>
         </w:rPr>
+        <w:lastRenderedPageBreak/>
         <w:t>edit variable.js</w:t>
       </w:r>
     </w:p>
@@ -1650,7 +1595,7 @@
                     <pic:cNvPicPr/>
                   </pic:nvPicPr>
                   <pic:blipFill>
-                    <a:blip r:embed="rId19"/>
+                    <a:blip r:embed="rId20"/>
                     <a:stretch>
                       <a:fillRect/>
                     </a:stretch>
@@ -1692,7 +1637,6 @@
           <w:sz w:val="24"/>
           <w:szCs w:val="24"/>
         </w:rPr>
-        <w:lastRenderedPageBreak/>
         <w:drawing>
           <wp:inline distT="0" distB="0" distL="0" distR="0" wp14:anchorId="6129187D" wp14:editId="64769801">
             <wp:extent cx="5247640" cy="975995"/>
@@ -1709,7 +1653,7 @@
                     <pic:cNvPicPr/>
                   </pic:nvPicPr>
                   <pic:blipFill>
-                    <a:blip r:embed="rId20"/>
+                    <a:blip r:embed="rId21"/>
                     <a:stretch>
                       <a:fillRect/>
                     </a:stretch>
@@ -1795,7 +1739,7 @@
                     <pic:cNvPicPr/>
                   </pic:nvPicPr>
                   <pic:blipFill>
-                    <a:blip r:embed="rId21"/>
+                    <a:blip r:embed="rId22"/>
                     <a:stretch>
                       <a:fillRect/>
                     </a:stretch>
@@ -1837,6 +1781,7 @@
           <w:sz w:val="24"/>
           <w:szCs w:val="24"/>
         </w:rPr>
+        <w:lastRenderedPageBreak/>
         <w:drawing>
           <wp:inline distT="0" distB="0" distL="0" distR="0" wp14:anchorId="42144ACB" wp14:editId="6C9BA16B">
             <wp:extent cx="5247640" cy="1666240"/>
@@ -1853,7 +1798,7 @@
                     <pic:cNvPicPr/>
                   </pic:nvPicPr>
                   <pic:blipFill>
-                    <a:blip r:embed="rId22"/>
+                    <a:blip r:embed="rId23"/>
                     <a:stretch>
                       <a:fillRect/>
                     </a:stretch>
@@ -1933,7 +1878,6 @@
           <w:sz w:val="24"/>
           <w:szCs w:val="24"/>
         </w:rPr>
-        <w:lastRenderedPageBreak/>
         <w:drawing>
           <wp:inline distT="0" distB="0" distL="0" distR="0" wp14:anchorId="481055BF" wp14:editId="35B6532F">
             <wp:extent cx="2962688" cy="885949"/>
@@ -1950,7 +1894,7 @@
                     <pic:cNvPicPr/>
                   </pic:nvPicPr>
                   <pic:blipFill>
-                    <a:blip r:embed="rId23"/>
+                    <a:blip r:embed="rId24"/>
                     <a:stretch>
                       <a:fillRect/>
                     </a:stretch>
@@ -2008,7 +1952,7 @@
                     <pic:cNvPicPr/>
                   </pic:nvPicPr>
                   <pic:blipFill>
-                    <a:blip r:embed="rId24"/>
+                    <a:blip r:embed="rId25"/>
                     <a:stretch>
                       <a:fillRect/>
                     </a:stretch>
@@ -2094,7 +2038,7 @@
                     <pic:cNvPicPr/>
                   </pic:nvPicPr>
                   <pic:blipFill>
-                    <a:blip r:embed="rId25"/>
+                    <a:blip r:embed="rId26"/>
                     <a:stretch>
                       <a:fillRect/>
                     </a:stretch>
@@ -2152,7 +2096,7 @@
                     <pic:cNvPicPr/>
                   </pic:nvPicPr>
                   <pic:blipFill>
-                    <a:blip r:embed="rId26"/>
+                    <a:blip r:embed="rId27"/>
                     <a:stretch>
                       <a:fillRect/>
                     </a:stretch>
@@ -2171,6 +2115,27 @@
             </a:graphic>
           </wp:inline>
         </w:drawing>
+      </w:r>
+    </w:p>
+    <w:p>
+      <w:pPr>
+        <w:rPr>
+          <w:rFonts w:ascii="Times New Roman" w:hAnsi="Times New Roman" w:cs="Times New Roman"/>
+          <w:b/>
+          <w:bCs/>
+          <w:sz w:val="24"/>
+          <w:szCs w:val="24"/>
+        </w:rPr>
+      </w:pPr>
+      <w:r>
+        <w:rPr>
+          <w:rFonts w:ascii="Times New Roman" w:hAnsi="Times New Roman" w:cs="Times New Roman"/>
+          <w:b/>
+          <w:bCs/>
+          <w:sz w:val="24"/>
+          <w:szCs w:val="24"/>
+        </w:rPr>
+        <w:br w:type="page"/>
       </w:r>
     </w:p>
     <w:p>
@@ -2198,6 +2163,7 @@
           <w:sz w:val="24"/>
           <w:szCs w:val="24"/>
         </w:rPr>
+        <w:lastRenderedPageBreak/>
         <w:t>if variable.js</w:t>
       </w:r>
     </w:p>
@@ -2238,7 +2204,7 @@
                     <pic:cNvPicPr/>
                   </pic:nvPicPr>
                   <pic:blipFill>
-                    <a:blip r:embed="rId27"/>
+                    <a:blip r:embed="rId28"/>
                     <a:stretch>
                       <a:fillRect/>
                     </a:stretch>
@@ -2296,7 +2262,7 @@
                     <pic:cNvPicPr/>
                   </pic:nvPicPr>
                   <pic:blipFill>
-                    <a:blip r:embed="rId28"/>
+                    <a:blip r:embed="rId29"/>
                     <a:stretch>
                       <a:fillRect/>
                     </a:stretch>
@@ -2366,7 +2332,6 @@
           <w:sz w:val="24"/>
           <w:szCs w:val="24"/>
         </w:rPr>
-        <w:lastRenderedPageBreak/>
         <w:drawing>
           <wp:inline distT="0" distB="0" distL="0" distR="0" wp14:anchorId="302F1845" wp14:editId="19C2D820">
             <wp:extent cx="3410426" cy="943107"/>
@@ -2383,7 +2348,7 @@
                     <pic:cNvPicPr/>
                   </pic:nvPicPr>
                   <pic:blipFill>
-                    <a:blip r:embed="rId29"/>
+                    <a:blip r:embed="rId30"/>
                     <a:stretch>
                       <a:fillRect/>
                     </a:stretch>
@@ -2441,7 +2406,7 @@
                     <pic:cNvPicPr/>
                   </pic:nvPicPr>
                   <pic:blipFill>
-                    <a:blip r:embed="rId30"/>
+                    <a:blip r:embed="rId31"/>
                     <a:stretch>
                       <a:fillRect/>
                     </a:stretch>
@@ -2527,7 +2492,7 @@
                     <pic:cNvPicPr/>
                   </pic:nvPicPr>
                   <pic:blipFill>
-                    <a:blip r:embed="rId31"/>
+                    <a:blip r:embed="rId32"/>
                     <a:stretch>
                       <a:fillRect/>
                     </a:stretch>
@@ -2569,6 +2534,7 @@
           <w:sz w:val="24"/>
           <w:szCs w:val="24"/>
         </w:rPr>
+        <w:lastRenderedPageBreak/>
         <w:drawing>
           <wp:inline distT="0" distB="0" distL="0" distR="0" wp14:anchorId="3BB91E06" wp14:editId="7AA490A0">
             <wp:extent cx="5247640" cy="1182370"/>
@@ -2585,7 +2551,7 @@
                     <pic:cNvPicPr/>
                   </pic:nvPicPr>
                   <pic:blipFill>
-                    <a:blip r:embed="rId32"/>
+                    <a:blip r:embed="rId33"/>
                     <a:stretch>
                       <a:fillRect/>
                     </a:stretch>
@@ -2671,7 +2637,7 @@
                     <pic:cNvPicPr/>
                   </pic:nvPicPr>
                   <pic:blipFill>
-                    <a:blip r:embed="rId33"/>
+                    <a:blip r:embed="rId34"/>
                     <a:stretch>
                       <a:fillRect/>
                     </a:stretch>
@@ -2713,7 +2679,6 @@
           <w:sz w:val="24"/>
           <w:szCs w:val="24"/>
         </w:rPr>
-        <w:lastRenderedPageBreak/>
         <w:drawing>
           <wp:inline distT="0" distB="0" distL="0" distR="0" wp14:anchorId="5C81D9BF" wp14:editId="6EAFBC5A">
             <wp:extent cx="5247640" cy="971550"/>
@@ -2730,7 +2695,7 @@
                     <pic:cNvPicPr/>
                   </pic:nvPicPr>
                   <pic:blipFill>
-                    <a:blip r:embed="rId34"/>
+                    <a:blip r:embed="rId35"/>
                     <a:stretch>
                       <a:fillRect/>
                     </a:stretch>
@@ -2816,7 +2781,7 @@
                     <pic:cNvPicPr/>
                   </pic:nvPicPr>
                   <pic:blipFill>
-                    <a:blip r:embed="rId35"/>
+                    <a:blip r:embed="rId36"/>
                     <a:stretch>
                       <a:fillRect/>
                     </a:stretch>
@@ -2874,7 +2839,7 @@
                     <pic:cNvPicPr/>
                   </pic:nvPicPr>
                   <pic:blipFill>
-                    <a:blip r:embed="rId36"/>
+                    <a:blip r:embed="rId37"/>
                     <a:stretch>
                       <a:fillRect/>
                     </a:stretch>
@@ -2960,7 +2925,7 @@
                     <pic:cNvPicPr/>
                   </pic:nvPicPr>
                   <pic:blipFill>
-                    <a:blip r:embed="rId37"/>
+                    <a:blip r:embed="rId38"/>
                     <a:stretch>
                       <a:fillRect/>
                     </a:stretch>
@@ -3002,6 +2967,7 @@
           <w:sz w:val="24"/>
           <w:szCs w:val="24"/>
         </w:rPr>
+        <w:lastRenderedPageBreak/>
         <w:drawing>
           <wp:inline distT="0" distB="0" distL="0" distR="0" wp14:anchorId="25A20788" wp14:editId="647DFFD8">
             <wp:extent cx="5247640" cy="795655"/>
@@ -3018,7 +2984,7 @@
                     <pic:cNvPicPr/>
                   </pic:nvPicPr>
                   <pic:blipFill>
-                    <a:blip r:embed="rId38"/>
+                    <a:blip r:embed="rId39"/>
                     <a:stretch>
                       <a:fillRect/>
                     </a:stretch>
@@ -3103,7 +3069,7 @@
                     <pic:cNvPicPr/>
                   </pic:nvPicPr>
                   <pic:blipFill>
-                    <a:blip r:embed="rId39"/>
+                    <a:blip r:embed="rId40"/>
                     <a:stretch>
                       <a:fillRect/>
                     </a:stretch>
@@ -3160,7 +3126,7 @@
                     <pic:cNvPicPr/>
                   </pic:nvPicPr>
                   <pic:blipFill>
-                    <a:blip r:embed="rId40"/>
+                    <a:blip r:embed="rId41"/>
                     <a:stretch>
                       <a:fillRect/>
                     </a:stretch>
@@ -3206,7 +3172,6 @@
           <w:sz w:val="24"/>
           <w:szCs w:val="24"/>
         </w:rPr>
-        <w:lastRenderedPageBreak/>
         <w:t>undefined.j</w:t>
       </w:r>
       <w:r>
@@ -3256,7 +3221,7 @@
                     <pic:cNvPicPr/>
                   </pic:nvPicPr>
                   <pic:blipFill>
-                    <a:blip r:embed="rId41"/>
+                    <a:blip r:embed="rId42"/>
                     <a:stretch>
                       <a:fillRect/>
                     </a:stretch>
@@ -3316,7 +3281,7 @@
                     </pic:cNvPicPr>
                   </pic:nvPicPr>
                   <pic:blipFill>
-                    <a:blip r:embed="rId42">
+                    <a:blip r:embed="rId43">
                       <a:extLst>
                         <a:ext uri="{28A0092B-C50C-407E-A947-70E740481C1C}">
                           <a14:useLocalDpi xmlns:a14="http://schemas.microsoft.com/office/drawing/2010/main" val="0"/>
@@ -3409,7 +3374,7 @@
                     <pic:cNvPicPr/>
                   </pic:nvPicPr>
                   <pic:blipFill>
-                    <a:blip r:embed="rId43"/>
+                    <a:blip r:embed="rId44"/>
                     <a:stretch>
                       <a:fillRect/>
                     </a:stretch>
@@ -3466,7 +3431,7 @@
                     <pic:cNvPicPr/>
                   </pic:nvPicPr>
                   <pic:blipFill>
-                    <a:blip r:embed="rId44"/>
+                    <a:blip r:embed="rId45"/>
                     <a:stretch>
                       <a:fillRect/>
                     </a:stretch>
@@ -3485,6 +3450,27 @@
             </a:graphic>
           </wp:inline>
         </w:drawing>
+      </w:r>
+    </w:p>
+    <w:p>
+      <w:pPr>
+        <w:rPr>
+          <w:rFonts w:ascii="Times New Roman" w:hAnsi="Times New Roman" w:cs="Times New Roman"/>
+          <w:b/>
+          <w:bCs/>
+          <w:sz w:val="24"/>
+          <w:szCs w:val="24"/>
+        </w:rPr>
+      </w:pPr>
+      <w:r>
+        <w:rPr>
+          <w:rFonts w:ascii="Times New Roman" w:hAnsi="Times New Roman" w:cs="Times New Roman"/>
+          <w:b/>
+          <w:bCs/>
+          <w:sz w:val="24"/>
+          <w:szCs w:val="24"/>
+        </w:rPr>
+        <w:br w:type="page"/>
       </w:r>
     </w:p>
     <w:p>
@@ -3512,6 +3498,7 @@
           <w:sz w:val="24"/>
           <w:szCs w:val="24"/>
         </w:rPr>
+        <w:lastRenderedPageBreak/>
         <w:t>symbol.js</w:t>
       </w:r>
     </w:p>
@@ -3551,7 +3538,7 @@
                     <pic:cNvPicPr/>
                   </pic:nvPicPr>
                   <pic:blipFill>
-                    <a:blip r:embed="rId45"/>
+                    <a:blip r:embed="rId46"/>
                     <a:stretch>
                       <a:fillRect/>
                     </a:stretch>
@@ -3608,7 +3595,7 @@
                     <pic:cNvPicPr/>
                   </pic:nvPicPr>
                   <pic:blipFill>
-                    <a:blip r:embed="rId46"/>
+                    <a:blip r:embed="rId47"/>
                     <a:stretch>
                       <a:fillRect/>
                     </a:stretch>
@@ -3693,7 +3680,7 @@
                     <pic:cNvPicPr/>
                   </pic:nvPicPr>
                   <pic:blipFill>
-                    <a:blip r:embed="rId47"/>
+                    <a:blip r:embed="rId48"/>
                     <a:stretch>
                       <a:fillRect/>
                     </a:stretch>
@@ -3734,7 +3721,6 @@
           <w:sz w:val="24"/>
           <w:szCs w:val="24"/>
         </w:rPr>
-        <w:lastRenderedPageBreak/>
         <w:drawing>
           <wp:inline distT="0" distB="0" distL="0" distR="0" wp14:anchorId="07DAD000" wp14:editId="660045B8">
             <wp:extent cx="5247640" cy="752475"/>
@@ -3751,7 +3737,7 @@
                     <pic:cNvPicPr/>
                   </pic:nvPicPr>
                   <pic:blipFill>
-                    <a:blip r:embed="rId48"/>
+                    <a:blip r:embed="rId49"/>
                     <a:stretch>
                       <a:fillRect/>
                     </a:stretch>
@@ -3789,27 +3775,15 @@
           <w:szCs w:val="24"/>
         </w:rPr>
       </w:pPr>
-      <w:proofErr w:type="spellStart"/>
-      <w:r>
-        <w:rPr>
-          <w:rFonts w:ascii="Times New Roman" w:hAnsi="Times New Roman" w:cs="Times New Roman"/>
-          <w:b/>
-          <w:bCs/>
-          <w:sz w:val="24"/>
-          <w:szCs w:val="24"/>
-        </w:rPr>
-        <w:t>convertion</w:t>
-      </w:r>
-      <w:proofErr w:type="spellEnd"/>
-      <w:r>
-        <w:rPr>
-          <w:rFonts w:ascii="Times New Roman" w:hAnsi="Times New Roman" w:cs="Times New Roman"/>
-          <w:b/>
-          <w:bCs/>
-          <w:sz w:val="24"/>
-          <w:szCs w:val="24"/>
-        </w:rPr>
-        <w:t xml:space="preserve"> string.js</w:t>
+      <w:r>
+        <w:rPr>
+          <w:rFonts w:ascii="Times New Roman" w:hAnsi="Times New Roman" w:cs="Times New Roman"/>
+          <w:b/>
+          <w:bCs/>
+          <w:sz w:val="24"/>
+          <w:szCs w:val="24"/>
+        </w:rPr>
+        <w:t>convertion string.js</w:t>
       </w:r>
     </w:p>
     <w:p>
@@ -3848,7 +3822,7 @@
                     <pic:cNvPicPr/>
                   </pic:nvPicPr>
                   <pic:blipFill>
-                    <a:blip r:embed="rId49"/>
+                    <a:blip r:embed="rId50"/>
                     <a:stretch>
                       <a:fillRect/>
                     </a:stretch>
@@ -3905,7 +3879,7 @@
                     <pic:cNvPicPr/>
                   </pic:nvPicPr>
                   <pic:blipFill>
-                    <a:blip r:embed="rId50"/>
+                    <a:blip r:embed="rId51"/>
                     <a:stretch>
                       <a:fillRect/>
                     </a:stretch>
@@ -3924,6 +3898,27 @@
             </a:graphic>
           </wp:inline>
         </w:drawing>
+      </w:r>
+    </w:p>
+    <w:p>
+      <w:pPr>
+        <w:rPr>
+          <w:rFonts w:ascii="Times New Roman" w:hAnsi="Times New Roman" w:cs="Times New Roman"/>
+          <w:b/>
+          <w:bCs/>
+          <w:sz w:val="24"/>
+          <w:szCs w:val="24"/>
+        </w:rPr>
+      </w:pPr>
+      <w:r>
+        <w:rPr>
+          <w:rFonts w:ascii="Times New Roman" w:hAnsi="Times New Roman" w:cs="Times New Roman"/>
+          <w:b/>
+          <w:bCs/>
+          <w:sz w:val="24"/>
+          <w:szCs w:val="24"/>
+        </w:rPr>
+        <w:br w:type="page"/>
       </w:r>
     </w:p>
     <w:p>
@@ -3943,27 +3938,16 @@
           <w:szCs w:val="24"/>
         </w:rPr>
       </w:pPr>
-      <w:proofErr w:type="spellStart"/>
-      <w:r>
-        <w:rPr>
-          <w:rFonts w:ascii="Times New Roman" w:hAnsi="Times New Roman" w:cs="Times New Roman"/>
-          <w:b/>
-          <w:bCs/>
-          <w:sz w:val="24"/>
-          <w:szCs w:val="24"/>
-        </w:rPr>
-        <w:t>convertion</w:t>
-      </w:r>
-      <w:proofErr w:type="spellEnd"/>
-      <w:r>
-        <w:rPr>
-          <w:rFonts w:ascii="Times New Roman" w:hAnsi="Times New Roman" w:cs="Times New Roman"/>
-          <w:b/>
-          <w:bCs/>
-          <w:sz w:val="24"/>
-          <w:szCs w:val="24"/>
-        </w:rPr>
-        <w:t xml:space="preserve"> numeric.js</w:t>
+      <w:r>
+        <w:rPr>
+          <w:rFonts w:ascii="Times New Roman" w:hAnsi="Times New Roman" w:cs="Times New Roman"/>
+          <w:b/>
+          <w:bCs/>
+          <w:sz w:val="24"/>
+          <w:szCs w:val="24"/>
+        </w:rPr>
+        <w:lastRenderedPageBreak/>
+        <w:t>convertion numeric.js</w:t>
       </w:r>
     </w:p>
     <w:p>
@@ -4002,7 +3986,7 @@
                     <pic:cNvPicPr/>
                   </pic:nvPicPr>
                   <pic:blipFill>
-                    <a:blip r:embed="rId51"/>
+                    <a:blip r:embed="rId52"/>
                     <a:stretch>
                       <a:fillRect/>
                     </a:stretch>
@@ -4059,7 +4043,7 @@
                     <pic:cNvPicPr/>
                   </pic:nvPicPr>
                   <pic:blipFill>
-                    <a:blip r:embed="rId52"/>
+                    <a:blip r:embed="rId53"/>
                     <a:stretch>
                       <a:fillRect/>
                     </a:stretch>
@@ -4097,27 +4081,15 @@
           <w:szCs w:val="24"/>
         </w:rPr>
       </w:pPr>
-      <w:proofErr w:type="spellStart"/>
-      <w:r>
-        <w:rPr>
-          <w:rFonts w:ascii="Times New Roman" w:hAnsi="Times New Roman" w:cs="Times New Roman"/>
-          <w:b/>
-          <w:bCs/>
-          <w:sz w:val="24"/>
-          <w:szCs w:val="24"/>
-        </w:rPr>
-        <w:t>convertion</w:t>
-      </w:r>
-      <w:proofErr w:type="spellEnd"/>
-      <w:r>
-        <w:rPr>
-          <w:rFonts w:ascii="Times New Roman" w:hAnsi="Times New Roman" w:cs="Times New Roman"/>
-          <w:b/>
-          <w:bCs/>
-          <w:sz w:val="24"/>
-          <w:szCs w:val="24"/>
-        </w:rPr>
-        <w:t xml:space="preserve"> </w:t>
+      <w:r>
+        <w:rPr>
+          <w:rFonts w:ascii="Times New Roman" w:hAnsi="Times New Roman" w:cs="Times New Roman"/>
+          <w:b/>
+          <w:bCs/>
+          <w:sz w:val="24"/>
+          <w:szCs w:val="24"/>
+        </w:rPr>
+        <w:t xml:space="preserve">convertion </w:t>
       </w:r>
       <w:r>
         <w:rPr>
@@ -4176,7 +4148,7 @@
                     <pic:cNvPicPr/>
                   </pic:nvPicPr>
                   <pic:blipFill>
-                    <a:blip r:embed="rId53"/>
+                    <a:blip r:embed="rId54"/>
                     <a:stretch>
                       <a:fillRect/>
                     </a:stretch>
@@ -4217,7 +4189,6 @@
           <w:sz w:val="24"/>
           <w:szCs w:val="24"/>
         </w:rPr>
-        <w:lastRenderedPageBreak/>
         <w:drawing>
           <wp:inline distT="0" distB="0" distL="0" distR="0" wp14:anchorId="0EB017B1" wp14:editId="1489900F">
             <wp:extent cx="4277322" cy="1209844"/>
@@ -4234,7 +4205,7 @@
                     <pic:cNvPicPr/>
                   </pic:nvPicPr>
                   <pic:blipFill>
-                    <a:blip r:embed="rId54"/>
+                    <a:blip r:embed="rId55"/>
                     <a:stretch>
                       <a:fillRect/>
                     </a:stretch>
@@ -4319,7 +4290,7 @@
                     <pic:cNvPicPr/>
                   </pic:nvPicPr>
                   <pic:blipFill>
-                    <a:blip r:embed="rId55"/>
+                    <a:blip r:embed="rId56"/>
                     <a:stretch>
                       <a:fillRect/>
                     </a:stretch>
@@ -4360,6 +4331,7 @@
           <w:sz w:val="24"/>
           <w:szCs w:val="24"/>
         </w:rPr>
+        <w:lastRenderedPageBreak/>
         <w:drawing>
           <wp:inline distT="0" distB="0" distL="0" distR="0" wp14:anchorId="1A1F1221" wp14:editId="350730BD">
             <wp:extent cx="409632" cy="1295581"/>
@@ -4376,7 +4348,7 @@
                     <pic:cNvPicPr/>
                   </pic:nvPicPr>
                   <pic:blipFill>
-                    <a:blip r:embed="rId56"/>
+                    <a:blip r:embed="rId57"/>
                     <a:stretch>
                       <a:fillRect/>
                     </a:stretch>
@@ -4461,7 +4433,7 @@
                     <pic:cNvPicPr/>
                   </pic:nvPicPr>
                   <pic:blipFill>
-                    <a:blip r:embed="rId57"/>
+                    <a:blip r:embed="rId58"/>
                     <a:stretch>
                       <a:fillRect/>
                     </a:stretch>
@@ -4518,7 +4490,7 @@
                     <pic:cNvPicPr/>
                   </pic:nvPicPr>
                   <pic:blipFill>
-                    <a:blip r:embed="rId58"/>
+                    <a:blip r:embed="rId59"/>
                     <a:stretch>
                       <a:fillRect/>
                     </a:stretch>
@@ -4564,7 +4536,6 @@
           <w:sz w:val="24"/>
           <w:szCs w:val="24"/>
         </w:rPr>
-        <w:lastRenderedPageBreak/>
         <w:t>logic.js</w:t>
       </w:r>
     </w:p>
@@ -4604,7 +4575,7 @@
                     <pic:cNvPicPr/>
                   </pic:nvPicPr>
                   <pic:blipFill>
-                    <a:blip r:embed="rId59"/>
+                    <a:blip r:embed="rId60"/>
                     <a:stretch>
                       <a:fillRect/>
                     </a:stretch>
@@ -4661,7 +4632,7 @@
                     <pic:cNvPicPr/>
                   </pic:nvPicPr>
                   <pic:blipFill>
-                    <a:blip r:embed="rId60"/>
+                    <a:blip r:embed="rId61"/>
                     <a:stretch>
                       <a:fillRect/>
                     </a:stretch>
@@ -4680,6 +4651,27 @@
             </a:graphic>
           </wp:inline>
         </w:drawing>
+      </w:r>
+    </w:p>
+    <w:p>
+      <w:pPr>
+        <w:rPr>
+          <w:rFonts w:ascii="Times New Roman" w:hAnsi="Times New Roman" w:cs="Times New Roman"/>
+          <w:b/>
+          <w:bCs/>
+          <w:sz w:val="24"/>
+          <w:szCs w:val="24"/>
+        </w:rPr>
+      </w:pPr>
+      <w:r>
+        <w:rPr>
+          <w:rFonts w:ascii="Times New Roman" w:hAnsi="Times New Roman" w:cs="Times New Roman"/>
+          <w:b/>
+          <w:bCs/>
+          <w:sz w:val="24"/>
+          <w:szCs w:val="24"/>
+        </w:rPr>
+        <w:br w:type="page"/>
       </w:r>
     </w:p>
     <w:p>
@@ -4707,6 +4699,7 @@
           <w:sz w:val="24"/>
           <w:szCs w:val="24"/>
         </w:rPr>
+        <w:lastRenderedPageBreak/>
         <w:t>bitwise.js</w:t>
       </w:r>
     </w:p>
@@ -4746,7 +4739,7 @@
                     <pic:cNvPicPr/>
                   </pic:nvPicPr>
                   <pic:blipFill>
-                    <a:blip r:embed="rId61"/>
+                    <a:blip r:embed="rId62"/>
                     <a:stretch>
                       <a:fillRect/>
                     </a:stretch>
@@ -4803,7 +4796,7 @@
                     <pic:cNvPicPr/>
                   </pic:nvPicPr>
                   <pic:blipFill>
-                    <a:blip r:embed="rId62"/>
+                    <a:blip r:embed="rId63"/>
                     <a:stretch>
                       <a:fillRect/>
                     </a:stretch>
@@ -4888,7 +4881,7 @@
                     <pic:cNvPicPr/>
                   </pic:nvPicPr>
                   <pic:blipFill>
-                    <a:blip r:embed="rId63"/>
+                    <a:blip r:embed="rId64"/>
                     <a:stretch>
                       <a:fillRect/>
                     </a:stretch>
@@ -4945,7 +4938,7 @@
                     <pic:cNvPicPr/>
                   </pic:nvPicPr>
                   <pic:blipFill>
-                    <a:blip r:embed="rId64"/>
+                    <a:blip r:embed="rId65"/>
                     <a:stretch>
                       <a:fillRect/>
                     </a:stretch>
@@ -5030,7 +5023,7 @@
                     <pic:cNvPicPr/>
                   </pic:nvPicPr>
                   <pic:blipFill>
-                    <a:blip r:embed="rId65"/>
+                    <a:blip r:embed="rId66"/>
                     <a:stretch>
                       <a:fillRect/>
                     </a:stretch>
@@ -5071,7 +5064,6 @@
           <w:sz w:val="24"/>
           <w:szCs w:val="24"/>
         </w:rPr>
-        <w:lastRenderedPageBreak/>
         <w:drawing>
           <wp:inline distT="0" distB="0" distL="0" distR="0" wp14:anchorId="45F10BD8" wp14:editId="4B603642">
             <wp:extent cx="4248743" cy="1190791"/>
@@ -5088,7 +5080,7 @@
                     <pic:cNvPicPr/>
                   </pic:nvPicPr>
                   <pic:blipFill>
-                    <a:blip r:embed="rId66"/>
+                    <a:blip r:embed="rId67"/>
                     <a:stretch>
                       <a:fillRect/>
                     </a:stretch>
@@ -5169,7 +5161,7 @@
                     <pic:cNvPicPr/>
                   </pic:nvPicPr>
                   <pic:blipFill>
-                    <a:blip r:embed="rId67"/>
+                    <a:blip r:embed="rId68"/>
                     <a:stretch>
                       <a:fillRect/>
                     </a:stretch>
@@ -5210,6 +5202,7 @@
           <w:sz w:val="24"/>
           <w:szCs w:val="24"/>
         </w:rPr>
+        <w:lastRenderedPageBreak/>
         <w:drawing>
           <wp:inline distT="0" distB="0" distL="0" distR="0" wp14:anchorId="07D679A3" wp14:editId="4A05292C">
             <wp:extent cx="4248743" cy="1533739"/>
@@ -5226,7 +5219,7 @@
                     <pic:cNvPicPr/>
                   </pic:nvPicPr>
                   <pic:blipFill>
-                    <a:blip r:embed="rId68"/>
+                    <a:blip r:embed="rId69"/>
                     <a:stretch>
                       <a:fillRect/>
                     </a:stretch>
@@ -5283,7 +5276,7 @@
                     <pic:cNvPicPr/>
                   </pic:nvPicPr>
                   <pic:blipFill>
-                    <a:blip r:embed="rId69"/>
+                    <a:blip r:embed="rId70"/>
                     <a:stretch>
                       <a:fillRect/>
                     </a:stretch>
@@ -5368,7 +5361,7 @@
                     <pic:cNvPicPr/>
                   </pic:nvPicPr>
                   <pic:blipFill>
-                    <a:blip r:embed="rId70"/>
+                    <a:blip r:embed="rId71"/>
                     <a:stretch>
                       <a:fillRect/>
                     </a:stretch>
@@ -5409,7 +5402,6 @@
           <w:sz w:val="24"/>
           <w:szCs w:val="24"/>
         </w:rPr>
-        <w:lastRenderedPageBreak/>
         <w:drawing>
           <wp:inline distT="0" distB="0" distL="0" distR="0" wp14:anchorId="034CB981" wp14:editId="317531CD">
             <wp:extent cx="4277322" cy="1200318"/>
@@ -5426,7 +5418,7 @@
                     <pic:cNvPicPr/>
                   </pic:nvPicPr>
                   <pic:blipFill>
-                    <a:blip r:embed="rId71"/>
+                    <a:blip r:embed="rId72"/>
                     <a:stretch>
                       <a:fillRect/>
                     </a:stretch>
@@ -5483,7 +5475,7 @@
                     <pic:cNvPicPr/>
                   </pic:nvPicPr>
                   <pic:blipFill>
-                    <a:blip r:embed="rId72"/>
+                    <a:blip r:embed="rId73"/>
                     <a:stretch>
                       <a:fillRect/>
                     </a:stretch>
@@ -5502,6 +5494,27 @@
             </a:graphic>
           </wp:inline>
         </w:drawing>
+      </w:r>
+    </w:p>
+    <w:p>
+      <w:pPr>
+        <w:rPr>
+          <w:rFonts w:ascii="Times New Roman" w:hAnsi="Times New Roman" w:cs="Times New Roman"/>
+          <w:b/>
+          <w:bCs/>
+          <w:sz w:val="24"/>
+          <w:szCs w:val="24"/>
+        </w:rPr>
+      </w:pPr>
+      <w:r>
+        <w:rPr>
+          <w:rFonts w:ascii="Times New Roman" w:hAnsi="Times New Roman" w:cs="Times New Roman"/>
+          <w:b/>
+          <w:bCs/>
+          <w:sz w:val="24"/>
+          <w:szCs w:val="24"/>
+        </w:rPr>
+        <w:br w:type="page"/>
       </w:r>
     </w:p>
     <w:p>
@@ -5529,6 +5542,7 @@
           <w:sz w:val="24"/>
           <w:szCs w:val="24"/>
         </w:rPr>
+        <w:lastRenderedPageBreak/>
         <w:t>if.js</w:t>
       </w:r>
     </w:p>
@@ -5568,7 +5582,7 @@
                     <pic:cNvPicPr/>
                   </pic:nvPicPr>
                   <pic:blipFill>
-                    <a:blip r:embed="rId73"/>
+                    <a:blip r:embed="rId74"/>
                     <a:stretch>
                       <a:fillRect/>
                     </a:stretch>
@@ -5621,7 +5635,7 @@
                     <pic:cNvPicPr/>
                   </pic:nvPicPr>
                   <pic:blipFill>
-                    <a:blip r:embed="rId74"/>
+                    <a:blip r:embed="rId75"/>
                     <a:stretch>
                       <a:fillRect/>
                     </a:stretch>
@@ -5678,7 +5692,7 @@
                     <pic:cNvPicPr/>
                   </pic:nvPicPr>
                   <pic:blipFill>
-                    <a:blip r:embed="rId75"/>
+                    <a:blip r:embed="rId76"/>
                     <a:stretch>
                       <a:fillRect/>
                     </a:stretch>
@@ -5747,7 +5761,6 @@
           <w:sz w:val="24"/>
           <w:szCs w:val="24"/>
         </w:rPr>
-        <w:lastRenderedPageBreak/>
         <w:drawing>
           <wp:inline distT="0" distB="0" distL="0" distR="0" wp14:anchorId="783FB08B" wp14:editId="3E64C838">
             <wp:extent cx="5087060" cy="1133633"/>
@@ -5764,7 +5777,7 @@
                     <pic:cNvPicPr/>
                   </pic:nvPicPr>
                   <pic:blipFill>
-                    <a:blip r:embed="rId76"/>
+                    <a:blip r:embed="rId77"/>
                     <a:stretch>
                       <a:fillRect/>
                     </a:stretch>
@@ -5821,7 +5834,7 @@
                     <pic:cNvPicPr/>
                   </pic:nvPicPr>
                   <pic:blipFill>
-                    <a:blip r:embed="rId77"/>
+                    <a:blip r:embed="rId78"/>
                     <a:stretch>
                       <a:fillRect/>
                     </a:stretch>
@@ -5862,6 +5875,7 @@
           <w:sz w:val="24"/>
           <w:szCs w:val="24"/>
         </w:rPr>
+        <w:lastRenderedPageBreak/>
         <w:drawing>
           <wp:inline distT="0" distB="0" distL="0" distR="0" wp14:anchorId="4BE188BC" wp14:editId="26478298">
             <wp:extent cx="4277322" cy="1181265"/>
@@ -5878,7 +5892,7 @@
                     <pic:cNvPicPr/>
                   </pic:nvPicPr>
                   <pic:blipFill>
-                    <a:blip r:embed="rId78"/>
+                    <a:blip r:embed="rId79"/>
                     <a:stretch>
                       <a:fillRect/>
                     </a:stretch>
@@ -5935,7 +5949,7 @@
                     <pic:cNvPicPr/>
                   </pic:nvPicPr>
                   <pic:blipFill>
-                    <a:blip r:embed="rId79"/>
+                    <a:blip r:embed="rId80"/>
                     <a:stretch>
                       <a:fillRect/>
                     </a:stretch>
@@ -6004,32 +6018,31 @@
           <w:sz w:val="24"/>
           <w:szCs w:val="24"/>
         </w:rPr>
-        <w:lastRenderedPageBreak/>
-        <w:drawing>
-          <wp:inline distT="0" distB="0" distL="0" distR="0" wp14:anchorId="614FAFD5" wp14:editId="49197AAF">
-            <wp:extent cx="2838846" cy="1752845"/>
-            <wp:effectExtent l="0" t="0" r="0" b="0"/>
-            <wp:docPr id="92" name="Picture 92"/>
-            <wp:cNvGraphicFramePr>
-              <a:graphicFrameLocks xmlns:a="http://schemas.openxmlformats.org/drawingml/2006/main" noChangeAspect="1"/>
-            </wp:cNvGraphicFramePr>
-            <a:graphic xmlns:a="http://schemas.openxmlformats.org/drawingml/2006/main">
-              <a:graphicData uri="http://schemas.openxmlformats.org/drawingml/2006/picture">
-                <pic:pic xmlns:pic="http://schemas.openxmlformats.org/drawingml/2006/picture">
-                  <pic:nvPicPr>
-                    <pic:cNvPr id="1" name=""/>
-                    <pic:cNvPicPr/>
-                  </pic:nvPicPr>
-                  <pic:blipFill>
-                    <a:blip r:embed="rId80"/>
-                    <a:stretch>
-                      <a:fillRect/>
-                    </a:stretch>
-                  </pic:blipFill>
-                  <pic:spPr>
-                    <a:xfrm>
-                      <a:off x="0" y="0"/>
-                      <a:ext cx="2838846" cy="1752845"/>
+        <w:drawing>
+          <wp:inline distT="0" distB="0" distL="0" distR="0" wp14:anchorId="4B644EEC" wp14:editId="62349CC8">
+            <wp:extent cx="2781688" cy="1686160"/>
+            <wp:effectExtent l="0" t="0" r="0" b="9525"/>
+            <wp:docPr id="121" name="Picture 121"/>
+            <wp:cNvGraphicFramePr>
+              <a:graphicFrameLocks xmlns:a="http://schemas.openxmlformats.org/drawingml/2006/main" noChangeAspect="1"/>
+            </wp:cNvGraphicFramePr>
+            <a:graphic xmlns:a="http://schemas.openxmlformats.org/drawingml/2006/main">
+              <a:graphicData uri="http://schemas.openxmlformats.org/drawingml/2006/picture">
+                <pic:pic xmlns:pic="http://schemas.openxmlformats.org/drawingml/2006/picture">
+                  <pic:nvPicPr>
+                    <pic:cNvPr id="1" name=""/>
+                    <pic:cNvPicPr/>
+                  </pic:nvPicPr>
+                  <pic:blipFill>
+                    <a:blip r:embed="rId81"/>
+                    <a:stretch>
+                      <a:fillRect/>
+                    </a:stretch>
+                  </pic:blipFill>
+                  <pic:spPr>
+                    <a:xfrm>
+                      <a:off x="0" y="0"/>
+                      <a:ext cx="2781688" cy="1686160"/>
                     </a:xfrm>
                     <a:prstGeom prst="rect">
                       <a:avLst/>
@@ -6078,7 +6091,7 @@
                     <pic:cNvPicPr/>
                   </pic:nvPicPr>
                   <pic:blipFill>
-                    <a:blip r:embed="rId81"/>
+                    <a:blip r:embed="rId82"/>
                     <a:stretch>
                       <a:fillRect/>
                     </a:stretch>
@@ -6119,6 +6132,7 @@
           <w:sz w:val="24"/>
           <w:szCs w:val="24"/>
         </w:rPr>
+        <w:lastRenderedPageBreak/>
         <w:drawing>
           <wp:inline distT="0" distB="0" distL="0" distR="0" wp14:anchorId="4B4CAF8A" wp14:editId="57F710B5">
             <wp:extent cx="4258269" cy="1524213"/>
@@ -6135,7 +6149,7 @@
                     <pic:cNvPicPr/>
                   </pic:nvPicPr>
                   <pic:blipFill>
-                    <a:blip r:embed="rId82"/>
+                    <a:blip r:embed="rId83"/>
                     <a:stretch>
                       <a:fillRect/>
                     </a:stretch>
@@ -6192,7 +6206,7 @@
                     <pic:cNvPicPr/>
                   </pic:nvPicPr>
                   <pic:blipFill>
-                    <a:blip r:embed="rId83"/>
+                    <a:blip r:embed="rId84"/>
                     <a:stretch>
                       <a:fillRect/>
                     </a:stretch>
@@ -6233,7 +6247,6 @@
           <w:sz w:val="24"/>
           <w:szCs w:val="24"/>
         </w:rPr>
-        <w:lastRenderedPageBreak/>
         <w:drawing>
           <wp:inline distT="0" distB="0" distL="0" distR="0" wp14:anchorId="3E775EAF" wp14:editId="0478416F">
             <wp:extent cx="4258269" cy="1533739"/>
@@ -6250,7 +6263,7 @@
                     <pic:cNvPicPr/>
                   </pic:nvPicPr>
                   <pic:blipFill>
-                    <a:blip r:embed="rId84"/>
+                    <a:blip r:embed="rId85"/>
                     <a:stretch>
                       <a:fillRect/>
                     </a:stretch>
@@ -6307,7 +6320,7 @@
                     <pic:cNvPicPr/>
                   </pic:nvPicPr>
                   <pic:blipFill>
-                    <a:blip r:embed="rId85"/>
+                    <a:blip r:embed="rId86"/>
                     <a:stretch>
                       <a:fillRect/>
                     </a:stretch>
@@ -6348,6 +6361,7 @@
           <w:sz w:val="24"/>
           <w:szCs w:val="24"/>
         </w:rPr>
+        <w:lastRenderedPageBreak/>
         <w:drawing>
           <wp:inline distT="0" distB="0" distL="0" distR="0" wp14:anchorId="04A4B05F" wp14:editId="3D0ED8B8">
             <wp:extent cx="4258269" cy="1533739"/>
@@ -6364,7 +6378,7 @@
                     <pic:cNvPicPr/>
                   </pic:nvPicPr>
                   <pic:blipFill>
-                    <a:blip r:embed="rId86"/>
+                    <a:blip r:embed="rId87"/>
                     <a:stretch>
                       <a:fillRect/>
                     </a:stretch>
@@ -6421,7 +6435,7 @@
                     <pic:cNvPicPr/>
                   </pic:nvPicPr>
                   <pic:blipFill>
-                    <a:blip r:embed="rId87"/>
+                    <a:blip r:embed="rId88"/>
                     <a:stretch>
                       <a:fillRect/>
                     </a:stretch>
@@ -6462,7 +6476,6 @@
           <w:sz w:val="24"/>
           <w:szCs w:val="24"/>
         </w:rPr>
-        <w:lastRenderedPageBreak/>
         <w:drawing>
           <wp:inline distT="0" distB="0" distL="0" distR="0" wp14:anchorId="6011DFDF" wp14:editId="28C65C75">
             <wp:extent cx="4258269" cy="1543265"/>
@@ -6479,7 +6492,7 @@
                     <pic:cNvPicPr/>
                   </pic:nvPicPr>
                   <pic:blipFill>
-                    <a:blip r:embed="rId88"/>
+                    <a:blip r:embed="rId89"/>
                     <a:stretch>
                       <a:fillRect/>
                     </a:stretch>
@@ -6536,7 +6549,7 @@
                     <pic:cNvPicPr/>
                   </pic:nvPicPr>
                   <pic:blipFill>
-                    <a:blip r:embed="rId89"/>
+                    <a:blip r:embed="rId90"/>
                     <a:stretch>
                       <a:fillRect/>
                     </a:stretch>
@@ -6555,6 +6568,27 @@
             </a:graphic>
           </wp:inline>
         </w:drawing>
+      </w:r>
+    </w:p>
+    <w:p>
+      <w:pPr>
+        <w:rPr>
+          <w:rFonts w:ascii="Times New Roman" w:hAnsi="Times New Roman" w:cs="Times New Roman"/>
+          <w:b/>
+          <w:bCs/>
+          <w:sz w:val="24"/>
+          <w:szCs w:val="24"/>
+        </w:rPr>
+      </w:pPr>
+      <w:r>
+        <w:rPr>
+          <w:rFonts w:ascii="Times New Roman" w:hAnsi="Times New Roman" w:cs="Times New Roman"/>
+          <w:b/>
+          <w:bCs/>
+          <w:sz w:val="24"/>
+          <w:szCs w:val="24"/>
+        </w:rPr>
+        <w:br w:type="page"/>
       </w:r>
     </w:p>
     <w:p>
@@ -6582,6 +6616,7 @@
           <w:sz w:val="24"/>
           <w:szCs w:val="24"/>
         </w:rPr>
+        <w:lastRenderedPageBreak/>
         <w:t>switch.js</w:t>
       </w:r>
     </w:p>
@@ -6621,7 +6656,7 @@
                     <pic:cNvPicPr/>
                   </pic:nvPicPr>
                   <pic:blipFill>
-                    <a:blip r:embed="rId90"/>
+                    <a:blip r:embed="rId91"/>
                     <a:stretch>
                       <a:fillRect/>
                     </a:stretch>
@@ -6678,7 +6713,7 @@
                     <pic:cNvPicPr/>
                   </pic:nvPicPr>
                   <pic:blipFill>
-                    <a:blip r:embed="rId91"/>
+                    <a:blip r:embed="rId92"/>
                     <a:stretch>
                       <a:fillRect/>
                     </a:stretch>
@@ -6747,7 +6782,6 @@
           <w:sz w:val="24"/>
           <w:szCs w:val="24"/>
         </w:rPr>
-        <w:lastRenderedPageBreak/>
         <w:drawing>
           <wp:inline distT="0" distB="0" distL="0" distR="0" wp14:anchorId="717E8DF0" wp14:editId="1F18284D">
             <wp:extent cx="2495898" cy="666843"/>
@@ -6764,7 +6798,7 @@
                     <pic:cNvPicPr/>
                   </pic:nvPicPr>
                   <pic:blipFill>
-                    <a:blip r:embed="rId92"/>
+                    <a:blip r:embed="rId93"/>
                     <a:stretch>
                       <a:fillRect/>
                     </a:stretch>
@@ -6821,7 +6855,7 @@
                     <pic:cNvPicPr/>
                   </pic:nvPicPr>
                   <pic:blipFill>
-                    <a:blip r:embed="rId93"/>
+                    <a:blip r:embed="rId94"/>
                     <a:stretch>
                       <a:fillRect/>
                     </a:stretch>
@@ -6840,6 +6874,27 @@
             </a:graphic>
           </wp:inline>
         </w:drawing>
+      </w:r>
+    </w:p>
+    <w:p>
+      <w:pPr>
+        <w:rPr>
+          <w:rFonts w:ascii="Times New Roman" w:hAnsi="Times New Roman" w:cs="Times New Roman"/>
+          <w:b/>
+          <w:bCs/>
+          <w:sz w:val="24"/>
+          <w:szCs w:val="24"/>
+        </w:rPr>
+      </w:pPr>
+      <w:r>
+        <w:rPr>
+          <w:rFonts w:ascii="Times New Roman" w:hAnsi="Times New Roman" w:cs="Times New Roman"/>
+          <w:b/>
+          <w:bCs/>
+          <w:sz w:val="24"/>
+          <w:szCs w:val="24"/>
+        </w:rPr>
+        <w:br w:type="page"/>
       </w:r>
     </w:p>
     <w:p>
@@ -6867,6 +6922,7 @@
           <w:sz w:val="24"/>
           <w:szCs w:val="24"/>
         </w:rPr>
+        <w:lastRenderedPageBreak/>
         <w:t>while.js</w:t>
       </w:r>
     </w:p>
@@ -6906,7 +6962,7 @@
                     <pic:cNvPicPr/>
                   </pic:nvPicPr>
                   <pic:blipFill>
-                    <a:blip r:embed="rId94"/>
+                    <a:blip r:embed="rId95"/>
                     <a:stretch>
                       <a:fillRect/>
                     </a:stretch>
@@ -6963,7 +7019,7 @@
                     <pic:cNvPicPr/>
                   </pic:nvPicPr>
                   <pic:blipFill>
-                    <a:blip r:embed="rId95"/>
+                    <a:blip r:embed="rId96"/>
                     <a:stretch>
                       <a:fillRect/>
                     </a:stretch>
@@ -7048,7 +7104,7 @@
                     <pic:cNvPicPr/>
                   </pic:nvPicPr>
                   <pic:blipFill>
-                    <a:blip r:embed="rId96"/>
+                    <a:blip r:embed="rId97"/>
                     <a:stretch>
                       <a:fillRect/>
                     </a:stretch>
@@ -7089,7 +7145,6 @@
           <w:sz w:val="24"/>
           <w:szCs w:val="24"/>
         </w:rPr>
-        <w:lastRenderedPageBreak/>
         <w:drawing>
           <wp:inline distT="0" distB="0" distL="0" distR="0" wp14:anchorId="441881B7" wp14:editId="29D6D32C">
             <wp:extent cx="5247640" cy="1518920"/>
@@ -7106,7 +7161,7 @@
                     <pic:cNvPicPr/>
                   </pic:nvPicPr>
                   <pic:blipFill>
-                    <a:blip r:embed="rId97"/>
+                    <a:blip r:embed="rId98"/>
                     <a:stretch>
                       <a:fillRect/>
                     </a:stretch>
@@ -7125,6 +7180,27 @@
             </a:graphic>
           </wp:inline>
         </w:drawing>
+      </w:r>
+    </w:p>
+    <w:p>
+      <w:pPr>
+        <w:rPr>
+          <w:rFonts w:ascii="Times New Roman" w:hAnsi="Times New Roman" w:cs="Times New Roman"/>
+          <w:b/>
+          <w:bCs/>
+          <w:sz w:val="24"/>
+          <w:szCs w:val="24"/>
+        </w:rPr>
+      </w:pPr>
+      <w:r>
+        <w:rPr>
+          <w:rFonts w:ascii="Times New Roman" w:hAnsi="Times New Roman" w:cs="Times New Roman"/>
+          <w:b/>
+          <w:bCs/>
+          <w:sz w:val="24"/>
+          <w:szCs w:val="24"/>
+        </w:rPr>
+        <w:br w:type="page"/>
       </w:r>
     </w:p>
     <w:p>
@@ -7152,6 +7228,7 @@
           <w:sz w:val="24"/>
           <w:szCs w:val="24"/>
         </w:rPr>
+        <w:lastRenderedPageBreak/>
         <w:t>break.js</w:t>
       </w:r>
     </w:p>
@@ -7191,7 +7268,7 @@
                     <pic:cNvPicPr/>
                   </pic:nvPicPr>
                   <pic:blipFill>
-                    <a:blip r:embed="rId98"/>
+                    <a:blip r:embed="rId99"/>
                     <a:stretch>
                       <a:fillRect/>
                     </a:stretch>
@@ -7248,7 +7325,7 @@
                     <pic:cNvPicPr/>
                   </pic:nvPicPr>
                   <pic:blipFill>
-                    <a:blip r:embed="rId99"/>
+                    <a:blip r:embed="rId100"/>
                     <a:stretch>
                       <a:fillRect/>
                     </a:stretch>
@@ -7333,7 +7410,7 @@
                     <pic:cNvPicPr/>
                   </pic:nvPicPr>
                   <pic:blipFill>
-                    <a:blip r:embed="rId100"/>
+                    <a:blip r:embed="rId101"/>
                     <a:stretch>
                       <a:fillRect/>
                     </a:stretch>
@@ -7374,7 +7451,6 @@
           <w:sz w:val="24"/>
           <w:szCs w:val="24"/>
         </w:rPr>
-        <w:lastRenderedPageBreak/>
         <w:drawing>
           <wp:inline distT="0" distB="0" distL="0" distR="0" wp14:anchorId="7643C032" wp14:editId="418DFC7D">
             <wp:extent cx="5247640" cy="1293495"/>
@@ -7391,7 +7467,7 @@
                     <pic:cNvPicPr/>
                   </pic:nvPicPr>
                   <pic:blipFill>
-                    <a:blip r:embed="rId101"/>
+                    <a:blip r:embed="rId102"/>
                     <a:stretch>
                       <a:fillRect/>
                     </a:stretch>
@@ -7410,6 +7486,27 @@
             </a:graphic>
           </wp:inline>
         </w:drawing>
+      </w:r>
+    </w:p>
+    <w:p>
+      <w:pPr>
+        <w:rPr>
+          <w:rFonts w:ascii="Times New Roman" w:hAnsi="Times New Roman" w:cs="Times New Roman"/>
+          <w:b/>
+          <w:bCs/>
+          <w:sz w:val="24"/>
+          <w:szCs w:val="24"/>
+        </w:rPr>
+      </w:pPr>
+      <w:r>
+        <w:rPr>
+          <w:rFonts w:ascii="Times New Roman" w:hAnsi="Times New Roman" w:cs="Times New Roman"/>
+          <w:b/>
+          <w:bCs/>
+          <w:sz w:val="24"/>
+          <w:szCs w:val="24"/>
+        </w:rPr>
+        <w:br w:type="page"/>
       </w:r>
     </w:p>
     <w:p>
@@ -7438,29 +7535,8 @@
           <w:sz w:val="24"/>
           <w:szCs w:val="24"/>
         </w:rPr>
-        <w:t xml:space="preserve">Edit index.html dan </w:t>
-      </w:r>
-      <w:proofErr w:type="spellStart"/>
-      <w:r>
-        <w:rPr>
-          <w:rFonts w:ascii="Times New Roman" w:hAnsi="Times New Roman" w:cs="Times New Roman"/>
-          <w:b/>
-          <w:bCs/>
-          <w:sz w:val="24"/>
-          <w:szCs w:val="24"/>
-        </w:rPr>
-        <w:t>menampilkan</w:t>
-      </w:r>
-      <w:proofErr w:type="spellEnd"/>
-      <w:r>
-        <w:rPr>
-          <w:rFonts w:ascii="Times New Roman" w:hAnsi="Times New Roman" w:cs="Times New Roman"/>
-          <w:b/>
-          <w:bCs/>
-          <w:sz w:val="24"/>
-          <w:szCs w:val="24"/>
-        </w:rPr>
-        <w:t xml:space="preserve"> carousel</w:t>
+        <w:lastRenderedPageBreak/>
+        <w:t>Edit index.html dan menampilkan carousel</w:t>
       </w:r>
     </w:p>
     <w:p>
@@ -7480,7 +7556,6 @@
           <w:sz w:val="24"/>
           <w:szCs w:val="24"/>
         </w:rPr>
-        <w:lastRenderedPageBreak/>
         <w:drawing>
           <wp:inline distT="0" distB="0" distL="0" distR="0" wp14:anchorId="7CB16BD6" wp14:editId="3BE9567C">
             <wp:extent cx="5247640" cy="6101715"/>
@@ -7497,7 +7572,7 @@
                     <pic:cNvPicPr/>
                   </pic:nvPicPr>
                   <pic:blipFill>
-                    <a:blip r:embed="rId102"/>
+                    <a:blip r:embed="rId103"/>
                     <a:stretch>
                       <a:fillRect/>
                     </a:stretch>
@@ -7552,7 +7627,7 @@
                     <pic:cNvPicPr/>
                   </pic:nvPicPr>
                   <pic:blipFill>
-                    <a:blip r:embed="rId103"/>
+                    <a:blip r:embed="rId104"/>
                     <a:stretch>
                       <a:fillRect/>
                     </a:stretch>
@@ -7604,7 +7679,7 @@
                     <pic:cNvPicPr/>
                   </pic:nvPicPr>
                   <pic:blipFill>
-                    <a:blip r:embed="rId104"/>
+                    <a:blip r:embed="rId105"/>
                     <a:stretch>
                       <a:fillRect/>
                     </a:stretch>
@@ -7623,6 +7698,177 @@
             </a:graphic>
           </wp:inline>
         </w:drawing>
+      </w:r>
+    </w:p>
+    <w:p>
+      <w:pPr>
+        <w:spacing w:line="360" w:lineRule="auto"/>
+        <w:jc w:val="center"/>
+        <w:rPr>
+          <w:rFonts w:ascii="Times New Roman" w:hAnsi="Times New Roman" w:cs="Times New Roman"/>
+          <w:sz w:val="24"/>
+          <w:szCs w:val="24"/>
+        </w:rPr>
+      </w:pPr>
+      <w:r>
+        <w:rPr>
+          <w:noProof/>
+        </w:rPr>
+        <w:drawing>
+          <wp:inline distT="0" distB="0" distL="0" distR="0" wp14:anchorId="22D0F728" wp14:editId="5A126C4A">
+            <wp:extent cx="5247640" cy="2951480"/>
+            <wp:effectExtent l="0" t="0" r="0" b="1270"/>
+            <wp:docPr id="118" name="Picture 118"/>
+            <wp:cNvGraphicFramePr>
+              <a:graphicFrameLocks xmlns:a="http://schemas.openxmlformats.org/drawingml/2006/main" noChangeAspect="1"/>
+            </wp:cNvGraphicFramePr>
+            <a:graphic xmlns:a="http://schemas.openxmlformats.org/drawingml/2006/main">
+              <a:graphicData uri="http://schemas.openxmlformats.org/drawingml/2006/picture">
+                <pic:pic xmlns:pic="http://schemas.openxmlformats.org/drawingml/2006/picture">
+                  <pic:nvPicPr>
+                    <pic:cNvPr id="1" name=""/>
+                    <pic:cNvPicPr/>
+                  </pic:nvPicPr>
+                  <pic:blipFill>
+                    <a:blip r:embed="rId106"/>
+                    <a:stretch>
+                      <a:fillRect/>
+                    </a:stretch>
+                  </pic:blipFill>
+                  <pic:spPr>
+                    <a:xfrm>
+                      <a:off x="0" y="0"/>
+                      <a:ext cx="5247640" cy="2951480"/>
+                    </a:xfrm>
+                    <a:prstGeom prst="rect">
+                      <a:avLst/>
+                    </a:prstGeom>
+                  </pic:spPr>
+                </pic:pic>
+              </a:graphicData>
+            </a:graphic>
+          </wp:inline>
+        </w:drawing>
+      </w:r>
+    </w:p>
+    <w:p>
+      <w:pPr>
+        <w:spacing w:line="360" w:lineRule="auto"/>
+        <w:jc w:val="center"/>
+        <w:rPr>
+          <w:rFonts w:ascii="Times New Roman" w:hAnsi="Times New Roman" w:cs="Times New Roman"/>
+          <w:sz w:val="24"/>
+          <w:szCs w:val="24"/>
+        </w:rPr>
+      </w:pPr>
+      <w:r>
+        <w:rPr>
+          <w:noProof/>
+        </w:rPr>
+        <w:lastRenderedPageBreak/>
+        <w:drawing>
+          <wp:inline distT="0" distB="0" distL="0" distR="0" wp14:anchorId="1F20662E" wp14:editId="795B3A19">
+            <wp:extent cx="5247640" cy="2951480"/>
+            <wp:effectExtent l="0" t="0" r="0" b="1270"/>
+            <wp:docPr id="119" name="Picture 119"/>
+            <wp:cNvGraphicFramePr>
+              <a:graphicFrameLocks xmlns:a="http://schemas.openxmlformats.org/drawingml/2006/main" noChangeAspect="1"/>
+            </wp:cNvGraphicFramePr>
+            <a:graphic xmlns:a="http://schemas.openxmlformats.org/drawingml/2006/main">
+              <a:graphicData uri="http://schemas.openxmlformats.org/drawingml/2006/picture">
+                <pic:pic xmlns:pic="http://schemas.openxmlformats.org/drawingml/2006/picture">
+                  <pic:nvPicPr>
+                    <pic:cNvPr id="1" name=""/>
+                    <pic:cNvPicPr/>
+                  </pic:nvPicPr>
+                  <pic:blipFill>
+                    <a:blip r:embed="rId107"/>
+                    <a:stretch>
+                      <a:fillRect/>
+                    </a:stretch>
+                  </pic:blipFill>
+                  <pic:spPr>
+                    <a:xfrm>
+                      <a:off x="0" y="0"/>
+                      <a:ext cx="5247640" cy="2951480"/>
+                    </a:xfrm>
+                    <a:prstGeom prst="rect">
+                      <a:avLst/>
+                    </a:prstGeom>
+                  </pic:spPr>
+                </pic:pic>
+              </a:graphicData>
+            </a:graphic>
+          </wp:inline>
+        </w:drawing>
+      </w:r>
+    </w:p>
+    <w:p>
+      <w:pPr>
+        <w:spacing w:line="360" w:lineRule="auto"/>
+        <w:jc w:val="center"/>
+        <w:rPr>
+          <w:rFonts w:ascii="Times New Roman" w:hAnsi="Times New Roman" w:cs="Times New Roman"/>
+          <w:sz w:val="24"/>
+          <w:szCs w:val="24"/>
+        </w:rPr>
+      </w:pPr>
+      <w:r>
+        <w:rPr>
+          <w:noProof/>
+        </w:rPr>
+        <w:drawing>
+          <wp:inline distT="0" distB="0" distL="0" distR="0" wp14:anchorId="6C2B286E" wp14:editId="63509E06">
+            <wp:extent cx="5247640" cy="2952115"/>
+            <wp:effectExtent l="0" t="0" r="0" b="635"/>
+            <wp:docPr id="117" name="Picture 117"/>
+            <wp:cNvGraphicFramePr>
+              <a:graphicFrameLocks xmlns:a="http://schemas.openxmlformats.org/drawingml/2006/main" noChangeAspect="1"/>
+            </wp:cNvGraphicFramePr>
+            <a:graphic xmlns:a="http://schemas.openxmlformats.org/drawingml/2006/main">
+              <a:graphicData uri="http://schemas.openxmlformats.org/drawingml/2006/picture">
+                <pic:pic xmlns:pic="http://schemas.openxmlformats.org/drawingml/2006/picture">
+                  <pic:nvPicPr>
+                    <pic:cNvPr id="1" name=""/>
+                    <pic:cNvPicPr/>
+                  </pic:nvPicPr>
+                  <pic:blipFill>
+                    <a:blip r:embed="rId108"/>
+                    <a:stretch>
+                      <a:fillRect/>
+                    </a:stretch>
+                  </pic:blipFill>
+                  <pic:spPr>
+                    <a:xfrm>
+                      <a:off x="0" y="0"/>
+                      <a:ext cx="5247640" cy="2952115"/>
+                    </a:xfrm>
+                    <a:prstGeom prst="rect">
+                      <a:avLst/>
+                    </a:prstGeom>
+                  </pic:spPr>
+                </pic:pic>
+              </a:graphicData>
+            </a:graphic>
+          </wp:inline>
+        </w:drawing>
+      </w:r>
+    </w:p>
+    <w:p>
+      <w:pPr>
+        <w:rPr>
+          <w:rFonts w:ascii="Times New Roman" w:hAnsi="Times New Roman" w:cs="Times New Roman"/>
+          <w:sz w:val="24"/>
+          <w:szCs w:val="24"/>
+        </w:rPr>
+      </w:pPr>
+      <w:r>
+        <w:rPr>
+          <w:rFonts w:ascii="Times New Roman" w:hAnsi="Times New Roman" w:cs="Times New Roman"/>
+          <w:sz w:val="24"/>
+          <w:szCs w:val="24"/>
+        </w:rPr>
+        <w:br w:type="page"/>
       </w:r>
     </w:p>
     <w:p>
@@ -7651,6 +7897,7 @@
           <w:sz w:val="24"/>
           <w:szCs w:val="24"/>
         </w:rPr>
+        <w:lastRenderedPageBreak/>
         <w:t>Upload ke GitHub</w:t>
       </w:r>
     </w:p>
@@ -7690,7 +7937,7 @@
                     <pic:cNvPicPr/>
                   </pic:nvPicPr>
                   <pic:blipFill>
-                    <a:blip r:embed="rId105"/>
+                    <a:blip r:embed="rId109"/>
                     <a:stretch>
                       <a:fillRect/>
                     </a:stretch>
@@ -7713,27 +7960,6 @@
     </w:p>
     <w:p>
       <w:pPr>
-        <w:rPr>
-          <w:rFonts w:ascii="Times New Roman" w:hAnsi="Times New Roman" w:cs="Times New Roman"/>
-          <w:b/>
-          <w:bCs/>
-          <w:sz w:val="24"/>
-          <w:szCs w:val="24"/>
-        </w:rPr>
-      </w:pPr>
-      <w:r>
-        <w:rPr>
-          <w:rFonts w:ascii="Times New Roman" w:hAnsi="Times New Roman" w:cs="Times New Roman"/>
-          <w:b/>
-          <w:bCs/>
-          <w:sz w:val="24"/>
-          <w:szCs w:val="24"/>
-        </w:rPr>
-        <w:br w:type="page"/>
-      </w:r>
-    </w:p>
-    <w:p>
-      <w:pPr>
         <w:spacing w:line="360" w:lineRule="auto"/>
         <w:jc w:val="both"/>
         <w:rPr>
@@ -7748,7 +7974,6 @@
           <w:sz w:val="24"/>
           <w:szCs w:val="24"/>
         </w:rPr>
-        <w:lastRenderedPageBreak/>
         <w:t>Link Repository GitHub:</w:t>
       </w:r>
     </w:p>
@@ -7757,7 +7982,7 @@
         <w:spacing w:line="360" w:lineRule="auto"/>
         <w:jc w:val="both"/>
       </w:pPr>
-      <w:hyperlink r:id="rId106" w:history="1">
+      <w:hyperlink r:id="rId110" w:history="1">
         <w:r>
           <w:rPr>
             <w:rStyle w:val="Hyperlink"/>

</xml_diff>